<commit_message>
manual: reorganize files; update CLAUDE.md for new layout
- Stata do-files moved into stata/ (do.do, do 1.do, do 2.do,
  hospitallevel_do.do)
- info for genAI.docx moved into project info/
- Older framing.docx moved into outdated/
- framing_rs.docx content updated
- CLAUDE.md: new "Repository layout" section, do-file paths re-prefixed
  with stata/, new "Experiment audit trail" section pointing at
  experiment-readme.md and the transcript-export workflow
- .gitignore: complete the .claude/settings.json rule that was missed
  in the prior settings-untrack commit
</commit_message>
<xml_diff>
--- a/framing_rs.docx
+++ b/framing_rs.docx
@@ -48,8 +48,11 @@
     </w:p>
     <w:p>
       <w:r>
-        <w:pict w14:anchorId="53282C37">
-          <v:rect id="_x0000_i1025" style="width:0;height:1.5pt" o:hralign="center" o:hrstd="t" o:hr="t"/>
+        <w:rPr>
+          <w:noProof/>
+        </w:rPr>
+        <w:pict w14:anchorId="3D506AC2">
+          <v:rect id="_x0000_i1029" alt="" style="width:468pt;height:.05pt;mso-width-percent:0;mso-height-percent:0;mso-width-percent:0;mso-height-percent:0" o:hralign="center" o:hrstd="t" o:hr="t"/>
         </w:pict>
       </w:r>
     </w:p>
@@ -565,8 +568,11 @@
     </w:p>
     <w:p>
       <w:r>
-        <w:pict w14:anchorId="53282C38">
-          <v:rect id="_x0000_i1026" style="width:0;height:1.5pt" o:hralign="center" o:hrstd="t" o:hr="t"/>
+        <w:rPr>
+          <w:noProof/>
+        </w:rPr>
+        <w:pict w14:anchorId="7BFF7AFF">
+          <v:rect id="_x0000_i1028" alt="" style="width:468pt;height:.05pt;mso-width-percent:0;mso-height-percent:0;mso-width-percent:0;mso-height-percent:0" o:hralign="center" o:hrstd="t" o:hr="t"/>
         </w:pict>
       </w:r>
     </w:p>
@@ -622,25 +628,7 @@
           <w:bCs/>
           <w:lang w:val="fr-FR"/>
         </w:rPr>
-        <w:t>National COVID-</w:t>
-      </w:r>
-      <w:proofErr w:type="spellStart"/>
-      <w:r>
-        <w:rPr>
-          <w:b/>
-          <w:bCs/>
-          <w:lang w:val="fr-FR"/>
-        </w:rPr>
-        <w:t>era</w:t>
-      </w:r>
-      <w:proofErr w:type="spellEnd"/>
-      <w:r>
-        <w:rPr>
-          <w:b/>
-          <w:bCs/>
-          <w:lang w:val="fr-FR"/>
-        </w:rPr>
-        <w:t xml:space="preserve"> trend</w:t>
+        <w:t>National COVID-era trend</w:t>
       </w:r>
       <w:r>
         <w:rPr>
@@ -711,8 +699,11 @@
     </w:p>
     <w:p>
       <w:r>
-        <w:pict w14:anchorId="53282C39">
-          <v:rect id="_x0000_i1027" style="width:0;height:1.5pt" o:hralign="center" o:hrstd="t" o:hr="t"/>
+        <w:rPr>
+          <w:noProof/>
+        </w:rPr>
+        <w:pict w14:anchorId="736C7870">
+          <v:rect id="_x0000_i1027" alt="" style="width:468pt;height:.05pt;mso-width-percent:0;mso-height-percent:0;mso-width-percent:0;mso-height-percent:0" o:hralign="center" o:hrstd="t" o:hr="t"/>
         </w:pict>
       </w:r>
     </w:p>
@@ -955,8 +946,11 @@
     </w:p>
     <w:p>
       <w:r>
-        <w:pict w14:anchorId="53282C3A">
-          <v:rect id="_x0000_i1028" style="width:0;height:1.5pt" o:hralign="center" o:hrstd="t" o:hr="t"/>
+        <w:rPr>
+          <w:noProof/>
+        </w:rPr>
+        <w:pict w14:anchorId="43C82B24">
+          <v:rect id="_x0000_i1026" alt="" style="width:468pt;height:.05pt;mso-width-percent:0;mso-height-percent:0;mso-width-percent:0;mso-height-percent:0" o:hralign="center" o:hrstd="t" o:hr="t"/>
         </w:pict>
       </w:r>
     </w:p>
@@ -1086,8 +1080,11 @@
     </w:p>
     <w:p>
       <w:r>
-        <w:pict w14:anchorId="53282C3B">
-          <v:rect id="_x0000_i1029" style="width:0;height:1.5pt" o:hralign="center" o:hrstd="t" o:hr="t"/>
+        <w:rPr>
+          <w:noProof/>
+        </w:rPr>
+        <w:pict w14:anchorId="7C2841FC">
+          <v:rect id="_x0000_i1025" alt="" style="width:468pt;height:.05pt;mso-width-percent:0;mso-height-percent:0;mso-width-percent:0;mso-height-percent:0" o:hralign="center" o:hrstd="t" o:hr="t"/>
         </w:pict>
       </w:r>
     </w:p>
@@ -1107,23 +1104,7 @@
         <w:pStyle w:val="FirstParagraph"/>
       </w:pPr>
       <w:r>
-        <w:t xml:space="preserve">Before we outline, I'd like </w:t>
-      </w:r>
-      <w:proofErr w:type="gramStart"/>
-      <w:r>
-        <w:t>your</w:t>
-      </w:r>
-      <w:proofErr w:type="gramEnd"/>
-      <w:r>
-        <w:t xml:space="preserve"> </w:t>
-      </w:r>
-      <w:proofErr w:type="gramStart"/>
-      <w:r>
-        <w:t>read</w:t>
-      </w:r>
-      <w:proofErr w:type="gramEnd"/>
-      <w:r>
-        <w:t xml:space="preserve"> on these:</w:t>
+        <w:t>Before we outline, I'd like your read on these:</w:t>
       </w:r>
     </w:p>
     <w:p>
@@ -1198,15 +1179,7 @@
         <w:t>(c) Rural-forward</w:t>
       </w:r>
       <w:r>
-        <w:t xml:space="preserve">: "Rural hospitals lead and are widening the patient-experience </w:t>
-      </w:r>
-      <w:proofErr w:type="gramStart"/>
-      <w:r>
-        <w:t>gap" —</w:t>
-      </w:r>
-      <w:proofErr w:type="gramEnd"/>
-      <w:r>
-        <w:t xml:space="preserve"> </w:t>
+        <w:t xml:space="preserve">: "Rural hospitals lead and are widening the patient-experience gap" — </w:t>
       </w:r>
       <w:commentRangeStart w:id="13"/>
       <w:r>
@@ -1216,6 +1189,8 @@
       <w:r>
         <w:rPr>
           <w:rStyle w:val="CommentReference"/>
+          <w:sz w:val="24"/>
+          <w:szCs w:val="24"/>
         </w:rPr>
         <w:commentReference w:id="13"/>
       </w:r>
@@ -1269,6 +1244,8 @@
       <w:r>
         <w:rPr>
           <w:rStyle w:val="CommentReference"/>
+          <w:sz w:val="24"/>
+          <w:szCs w:val="24"/>
         </w:rPr>
         <w:commentReference w:id="14"/>
       </w:r>
@@ -1326,23 +1303,7 @@
         <w:pStyle w:val="BodyText"/>
       </w:pPr>
       <w:r>
-        <w:t xml:space="preserve">ok! sure! </w:t>
-      </w:r>
-      <w:proofErr w:type="gramStart"/>
-      <w:r>
-        <w:t>so</w:t>
-      </w:r>
-      <w:proofErr w:type="gramEnd"/>
-      <w:r>
-        <w:t xml:space="preserve"> the focus of my version is "how little sociodemographic characteristics can explain the changes in the satisfaction over time", while those </w:t>
-      </w:r>
-      <w:proofErr w:type="gramStart"/>
-      <w:r>
-        <w:t>chars</w:t>
-      </w:r>
-      <w:proofErr w:type="gramEnd"/>
-      <w:r>
-        <w:t xml:space="preserve"> would explain a lot on the level </w:t>
+        <w:t xml:space="preserve">From the analyst of the study: </w:t>
       </w:r>
     </w:p>
     <w:p>
@@ -1350,60 +1311,29 @@
         <w:pStyle w:val="BodyText"/>
       </w:pPr>
       <w:r>
-        <w:t xml:space="preserve">and only a few things </w:t>
-      </w:r>
-      <w:proofErr w:type="gramStart"/>
-      <w:r>
-        <w:t>was</w:t>
-      </w:r>
-      <w:proofErr w:type="gramEnd"/>
-      <w:r>
-        <w:t xml:space="preserve"> the strong predictor of the </w:t>
-      </w:r>
-      <w:proofErr w:type="gramStart"/>
-      <w:r>
-        <w:t>change ;</w:t>
-      </w:r>
-      <w:proofErr w:type="gramEnd"/>
-      <w:r>
-        <w:t xml:space="preserve"> one of which was the time during the ED visit</w:t>
+        <w:t>‘</w:t>
+      </w:r>
+      <w:r>
+        <w:t>ok! sure! so the focus of my version is "how little sociodemographic characteristics can explain the changes in the satisfaction over time", while those chars would explain a lot on the level </w:t>
       </w:r>
     </w:p>
     <w:p>
       <w:pPr>
         <w:pStyle w:val="BodyText"/>
       </w:pPr>
-      <w:proofErr w:type="gramStart"/>
-      <w:r>
-        <w:t>so</w:t>
-      </w:r>
-      <w:proofErr w:type="gramEnd"/>
-      <w:r>
-        <w:t xml:space="preserve"> </w:t>
-      </w:r>
-      <w:proofErr w:type="spellStart"/>
-      <w:r>
-        <w:t>enveironment</w:t>
-      </w:r>
-      <w:proofErr w:type="spellEnd"/>
-      <w:r>
-        <w:t xml:space="preserve"> can explain how the rating could be (which is bad news for incentive program), but hospital-specific </w:t>
-      </w:r>
-      <w:proofErr w:type="gramStart"/>
-      <w:r>
-        <w:t>factor</w:t>
-      </w:r>
-      <w:proofErr w:type="gramEnd"/>
-      <w:r>
-        <w:t xml:space="preserve"> could influence the change, which might be a good sign for </w:t>
-      </w:r>
-      <w:proofErr w:type="gramStart"/>
-      <w:r>
-        <w:t>hospital</w:t>
-      </w:r>
-      <w:proofErr w:type="gramEnd"/>
-      <w:r>
-        <w:t xml:space="preserve"> because they can control that and change that </w:t>
+      <w:r>
+        <w:t>and only a few things was the strong predictor of the change ; one of which was the time during the ED visit</w:t>
+      </w:r>
+    </w:p>
+    <w:p>
+      <w:pPr>
+        <w:pStyle w:val="BodyText"/>
+      </w:pPr>
+      <w:r>
+        <w:t>so enveironment can explain how the rating could be (which is bad news for incentive program), but hospital-specific factor could influence the change, which might be a good sign for hospital because they can control that and change that</w:t>
+      </w:r>
+      <w:r>
+        <w:t>’</w:t>
       </w:r>
     </w:p>
     <w:p>
@@ -2385,6 +2315,7 @@
   <w:style w:type="character" w:default="1" w:styleId="DefaultParagraphFont">
     <w:name w:val="Default Paragraph Font"/>
     <w:uiPriority w:val="1"/>
+    <w:semiHidden/>
     <w:unhideWhenUsed/>
   </w:style>
   <w:style w:type="table" w:default="1" w:styleId="TableNormal">

</xml_diff>